<commit_message>
Restyle Fanda features document
</commit_message>
<xml_diff>
--- a/Essentials/Fanda.docx
+++ b/Essentials/Fanda.docx
@@ -4,486 +4,460 @@
   <w:body>
     <w:p>
       <w:pPr>
-        <w:pStyle w:val="Title"/>
+        <w:spacing w:after="200"/>
+        <w:jc w:val="center"/>
+        <w:shd w:fill="F3E5C0"/>
+        <w:pBdr>
+          <w:bottom w:val="single" w:sz="8" w:space="6" w:color="9B6A2D"/>
+        </w:pBdr>
       </w:pPr>
       <w:r>
-        <w:t>Fanda Franta - Features &amp; Traits</w:t>
-      </w:r>
-    </w:p>
-    <w:p>
-      <w:r>
-        <w:t>Vypsano podle pole Features &amp; Traits z PDF character sheetu Essentials/Fanda Franta.pdf. Texty jsou prakticke ceske parafraze pravidel dohledanych na D&amp;D Beyond; nejde o doslovnou kopii celeho zdrojoveho textu.</w:t>
-      </w:r>
-    </w:p>
-    <w:p>
-      <w:r>
         <w:rPr>
+          <w:rFonts w:ascii="Garamond" w:hAnsi="Garamond"/>
           <w:b/>
+          <w:color w:val="4A260F"/>
+          <w:sz w:val="56"/>
         </w:rPr>
-        <w:t>Zdroje:</w:t>
+        <w:t>Poklady Trominu - Fanda Franta</w:t>
       </w:r>
     </w:p>
     <w:p>
       <w:pPr>
-        <w:pStyle w:val="ListBullet"/>
+        <w:spacing w:before="260" w:after="80"/>
+        <w:pBdr>
+          <w:bottom w:val="single" w:sz="8" w:space="6" w:color="7A4A22"/>
+        </w:pBdr>
       </w:pPr>
       <w:r>
-        <w:t>https://www.dndbeyond.com/subclasses/1316-gunslinger</w:t>
-      </w:r>
-    </w:p>
-    <w:p>
-      <w:pPr>
-        <w:pStyle w:val="ListBullet"/>
-      </w:pPr>
-      <w:r>
-        <w:t>https://www.dndbeyond.com/classes/10-fighter</w:t>
-      </w:r>
-    </w:p>
-    <w:p>
-      <w:pPr>
-        <w:pStyle w:val="Heading1"/>
-      </w:pPr>
-      <w:r>
-        <w:t>Polozky nalezene v PDF</w:t>
-      </w:r>
-    </w:p>
-    <w:p>
-      <w:pPr>
-        <w:pStyle w:val="ListBullet"/>
-      </w:pPr>
-      <w:r>
-        <w:t>Fighter 4</w:t>
-      </w:r>
-    </w:p>
-    <w:p>
-      <w:pPr>
-        <w:pStyle w:val="ListBullet"/>
-      </w:pPr>
-      <w:r>
-        <w:t>Gunslinger</w:t>
-      </w:r>
-    </w:p>
-    <w:p>
-      <w:pPr>
-        <w:pStyle w:val="ListBullet"/>
-      </w:pPr>
-      <w:r>
-        <w:t>Close Quarters Shooter</w:t>
-      </w:r>
-    </w:p>
-    <w:p>
-      <w:pPr>
-        <w:pStyle w:val="ListBullet"/>
-      </w:pPr>
-      <w:r>
+        <w:rPr>
+          <w:rFonts w:ascii="Garamond" w:hAnsi="Garamond"/>
+          <w:b/>
+          <w:color w:val="5C3114"/>
+          <w:sz w:val="32"/>
+        </w:rPr>
         <w:t>Firearm Proficiency</w:t>
       </w:r>
     </w:p>
     <w:p>
       <w:pPr>
         <w:pStyle w:val="ListBullet"/>
+        <w:spacing w:after="60"/>
+        <w:ind w:left="360"/>
       </w:pPr>
       <w:r>
+        <w:rPr>
+          <w:rFonts w:ascii="Garamond" w:hAnsi="Garamond"/>
+          <w:color w:val="2D1F15"/>
+          <w:sz w:val="23"/>
+        </w:rPr>
+        <w:t>Upon taking the Gunslinger archetype at 3rd level, Fanda is trained in the use of firearms.</w:t>
+      </w:r>
+    </w:p>
+    <w:p>
+      <w:pPr>
+        <w:pStyle w:val="ListBullet"/>
+        <w:spacing w:after="60"/>
+        <w:ind w:left="360"/>
+      </w:pPr>
+      <w:r>
+        <w:rPr>
+          <w:rFonts w:ascii="Garamond" w:hAnsi="Garamond"/>
+          <w:color w:val="2D1F15"/>
+          <w:sz w:val="23"/>
+        </w:rPr>
+        <w:t>He adds his proficiency bonus to attack rolls made with firearms, treating these weapons as tools of practiced craft rather than strange curiosities.</w:t>
+      </w:r>
+    </w:p>
+    <w:p>
+      <w:pPr>
+        <w:spacing w:before="260" w:after="80"/>
+        <w:pBdr>
+          <w:bottom w:val="single" w:sz="8" w:space="6" w:color="7A4A22"/>
+        </w:pBdr>
+      </w:pPr>
+      <w:r>
+        <w:rPr>
+          <w:rFonts w:ascii="Garamond" w:hAnsi="Garamond"/>
+          <w:b/>
+          <w:color w:val="5C3114"/>
+          <w:sz w:val="32"/>
+        </w:rPr>
         <w:t>Gunsmith</w:t>
       </w:r>
     </w:p>
     <w:p>
       <w:pPr>
         <w:pStyle w:val="ListBullet"/>
+        <w:spacing w:after="60"/>
+        <w:ind w:left="360"/>
       </w:pPr>
       <w:r>
+        <w:rPr>
+          <w:rFonts w:ascii="Garamond" w:hAnsi="Garamond"/>
+          <w:color w:val="2D1F15"/>
+          <w:sz w:val="23"/>
+        </w:rPr>
+        <w:t>Fanda is proficient with Tinker's Tools and can turn powder, metal, and patience into working weapons and ammunition.</w:t>
+      </w:r>
+    </w:p>
+    <w:p>
+      <w:pPr>
+        <w:pStyle w:val="ListBullet"/>
+        <w:spacing w:after="60"/>
+        <w:ind w:left="360"/>
+      </w:pPr>
+      <w:r>
+        <w:rPr>
+          <w:rFonts w:ascii="Garamond" w:hAnsi="Garamond"/>
+          <w:color w:val="2D1F15"/>
+          <w:sz w:val="23"/>
+        </w:rPr>
+        <w:t>With proper materials, he can craft ammunition at half cost, repair damaged firearms, and, at the DM's discretion, draft or create new firearms.</w:t>
+      </w:r>
+    </w:p>
+    <w:p>
+      <w:pPr>
+        <w:pStyle w:val="ListBullet"/>
+        <w:spacing w:after="60"/>
+        <w:ind w:left="360"/>
+      </w:pPr>
+      <w:r>
+        <w:rPr>
+          <w:rFonts w:ascii="Garamond" w:hAnsi="Garamond"/>
+          <w:color w:val="2D1F15"/>
+          <w:sz w:val="23"/>
+        </w:rPr>
+        <w:t>Firearms use unstable properties such as Reload and Misfire. Reload limits how many shots can be fired before spending an attack or action to reload; Misfire can make the weapon fail until repaired with Tinker's Tools.</w:t>
+      </w:r>
+    </w:p>
+    <w:p>
+      <w:pPr>
+        <w:pStyle w:val="ListBullet"/>
+        <w:spacing w:after="60"/>
+        <w:ind w:left="360"/>
+      </w:pPr>
+      <w:r>
+        <w:rPr>
+          <w:rFonts w:ascii="Garamond" w:hAnsi="Garamond"/>
+          <w:color w:val="2D1F15"/>
+          <w:sz w:val="23"/>
+        </w:rPr>
+        <w:t>Some firearms or ammunition may be rare enough that crafting is the only reliable way to obtain them.</w:t>
+      </w:r>
+    </w:p>
+    <w:p>
+      <w:pPr>
+        <w:spacing w:before="260" w:after="80"/>
+        <w:pBdr>
+          <w:bottom w:val="single" w:sz="8" w:space="6" w:color="7A4A22"/>
+        </w:pBdr>
+      </w:pPr>
+      <w:r>
+        <w:rPr>
+          <w:rFonts w:ascii="Garamond" w:hAnsi="Garamond"/>
+          <w:b/>
+          <w:color w:val="5C3114"/>
+          <w:sz w:val="32"/>
+        </w:rPr>
         <w:t>Adept Marksman</w:t>
       </w:r>
     </w:p>
     <w:p>
       <w:pPr>
         <w:pStyle w:val="ListBullet"/>
+        <w:spacing w:after="60"/>
+        <w:ind w:left="360"/>
       </w:pPr>
       <w:r>
+        <w:rPr>
+          <w:rFonts w:ascii="Garamond" w:hAnsi="Garamond"/>
+          <w:color w:val="2D1F15"/>
+          <w:sz w:val="23"/>
+        </w:rPr>
+        <w:t>Fanda has learned trick shots, special firearm techniques meant to wound, disrupt, disarm, or drive enemies from the field.</w:t>
+      </w:r>
+    </w:p>
+    <w:p>
+      <w:pPr>
+        <w:pStyle w:val="ListBullet"/>
+        <w:spacing w:after="60"/>
+        <w:ind w:left="360"/>
+      </w:pPr>
+      <w:r>
+        <w:rPr>
+          <w:rFonts w:ascii="Garamond" w:hAnsi="Garamond"/>
+          <w:color w:val="2D1F15"/>
+          <w:sz w:val="23"/>
+        </w:rPr>
+        <w:t>He knows two trick shots at 3rd level and gains more at later Gunslinger levels. When he learns a new one, he may replace one trick shot he already knows.</w:t>
+      </w:r>
+    </w:p>
+    <w:p>
+      <w:pPr>
+        <w:pStyle w:val="ListBullet"/>
+        <w:spacing w:after="60"/>
+        <w:ind w:left="360"/>
+      </w:pPr>
+      <w:r>
+        <w:rPr>
+          <w:rFonts w:ascii="Garamond" w:hAnsi="Garamond"/>
+          <w:color w:val="2D1F15"/>
+          <w:sz w:val="23"/>
+        </w:rPr>
+        <w:t>A trick shot must be declared before the attack roll, and only one trick shot can be used on a single attack.</w:t>
+      </w:r>
+    </w:p>
+    <w:p>
+      <w:pPr>
+        <w:pStyle w:val="ListBullet"/>
+        <w:spacing w:after="60"/>
+        <w:ind w:left="360"/>
+      </w:pPr>
+      <w:r>
+        <w:rPr>
+          <w:rFonts w:ascii="Garamond" w:hAnsi="Garamond"/>
+          <w:color w:val="2D1F15"/>
+          <w:sz w:val="23"/>
+        </w:rPr>
+        <w:t>His grit points equal his Wisdom modifier, with a minimum of 1. He regains grit after a short or long rest, and can also regain it through a critical firearm attack or a decisive firearm kill against a meaningful threat, as judged by the DM.</w:t>
+      </w:r>
+    </w:p>
+    <w:p>
+      <w:pPr>
+        <w:pStyle w:val="ListBullet"/>
+        <w:spacing w:after="60"/>
+        <w:ind w:left="360"/>
+      </w:pPr>
+      <w:r>
+        <w:rPr>
+          <w:rFonts w:ascii="Garamond" w:hAnsi="Garamond"/>
+          <w:color w:val="2D1F15"/>
+          <w:sz w:val="23"/>
+        </w:rPr>
+        <w:t>When a trick shot calls for a saving throw, the DC is 8 + proficiency bonus + Dexterity modifier.</w:t>
+      </w:r>
+    </w:p>
+    <w:p>
+      <w:pPr>
+        <w:spacing w:before="260" w:after="80"/>
+        <w:pBdr>
+          <w:bottom w:val="single" w:sz="8" w:space="6" w:color="7A4A22"/>
+        </w:pBdr>
+      </w:pPr>
+      <w:r>
+        <w:rPr>
+          <w:rFonts w:ascii="Garamond" w:hAnsi="Garamond"/>
+          <w:b/>
+          <w:color w:val="5C3114"/>
+          <w:sz w:val="32"/>
+        </w:rPr>
         <w:t>Fighting Style: Close Quarters Shooter</w:t>
       </w:r>
     </w:p>
     <w:p>
       <w:pPr>
         <w:pStyle w:val="ListBullet"/>
+        <w:spacing w:after="60"/>
+        <w:ind w:left="360"/>
       </w:pPr>
       <w:r>
+        <w:rPr>
+          <w:rFonts w:ascii="Garamond" w:hAnsi="Garamond"/>
+          <w:color w:val="2D1F15"/>
+          <w:sz w:val="23"/>
+        </w:rPr>
+        <w:t>The character sheet names Close Quarters Shooter as Fanda's Fighting Style.</w:t>
+      </w:r>
+    </w:p>
+    <w:p>
+      <w:pPr>
+        <w:pStyle w:val="ListBullet"/>
+        <w:spacing w:after="60"/>
+        <w:ind w:left="360"/>
+      </w:pPr>
+      <w:r>
+        <w:rPr>
+          <w:rFonts w:ascii="Garamond" w:hAnsi="Garamond"/>
+          <w:color w:val="2D1F15"/>
+          <w:sz w:val="23"/>
+        </w:rPr>
+        <w:t>The exact rule text for Close Quarters Shooter is still missing, so this trait remains without its full mechanics here.</w:t>
+      </w:r>
+    </w:p>
+    <w:p>
+      <w:pPr>
+        <w:spacing w:before="260" w:after="80"/>
+        <w:pBdr>
+          <w:bottom w:val="single" w:sz="8" w:space="6" w:color="7A4A22"/>
+        </w:pBdr>
+      </w:pPr>
+      <w:r>
+        <w:rPr>
+          <w:rFonts w:ascii="Garamond" w:hAnsi="Garamond"/>
+          <w:b/>
+          <w:color w:val="5C3114"/>
+          <w:sz w:val="32"/>
+        </w:rPr>
         <w:t>Second Wind</w:t>
       </w:r>
     </w:p>
     <w:p>
       <w:pPr>
         <w:pStyle w:val="ListBullet"/>
+        <w:spacing w:after="60"/>
+        <w:ind w:left="360"/>
       </w:pPr>
       <w:r>
+        <w:rPr>
+          <w:rFonts w:ascii="Garamond" w:hAnsi="Garamond"/>
+          <w:color w:val="2D1F15"/>
+          <w:sz w:val="23"/>
+        </w:rPr>
+        <w:t>Fanda can draw on a reserve of battlefield endurance to recover in the middle of danger.</w:t>
+      </w:r>
+    </w:p>
+    <w:p>
+      <w:pPr>
+        <w:pStyle w:val="ListBullet"/>
+        <w:spacing w:after="60"/>
+        <w:ind w:left="360"/>
+      </w:pPr>
+      <w:r>
+        <w:rPr>
+          <w:rFonts w:ascii="Garamond" w:hAnsi="Garamond"/>
+          <w:color w:val="2D1F15"/>
+          <w:sz w:val="23"/>
+        </w:rPr>
+        <w:t>On his turn, he can use a bonus action to regain hit points equal to 1d10 + his fighter level.</w:t>
+      </w:r>
+    </w:p>
+    <w:p>
+      <w:pPr>
+        <w:pStyle w:val="ListBullet"/>
+        <w:spacing w:after="60"/>
+        <w:ind w:left="360"/>
+      </w:pPr>
+      <w:r>
+        <w:rPr>
+          <w:rFonts w:ascii="Garamond" w:hAnsi="Garamond"/>
+          <w:color w:val="2D1F15"/>
+          <w:sz w:val="23"/>
+        </w:rPr>
+        <w:t>After using this feature, he must finish a short or long rest before he can use it again.</w:t>
+      </w:r>
+    </w:p>
+    <w:p>
+      <w:pPr>
+        <w:spacing w:before="260" w:after="80"/>
+        <w:pBdr>
+          <w:bottom w:val="single" w:sz="8" w:space="6" w:color="7A4A22"/>
+        </w:pBdr>
+      </w:pPr>
+      <w:r>
+        <w:rPr>
+          <w:rFonts w:ascii="Garamond" w:hAnsi="Garamond"/>
+          <w:b/>
+          <w:color w:val="5C3114"/>
+          <w:sz w:val="32"/>
+        </w:rPr>
         <w:t>Action Surge</w:t>
       </w:r>
     </w:p>
     <w:p>
       <w:pPr>
         <w:pStyle w:val="ListBullet"/>
+        <w:spacing w:after="60"/>
+        <w:ind w:left="360"/>
       </w:pPr>
       <w:r>
-        <w:t>Martial Archetype</w:t>
-      </w:r>
-    </w:p>
-    <w:p>
-      <w:pPr>
-        <w:pStyle w:val="Heading1"/>
-      </w:pPr>
-      <w:r>
-        <w:t>Firearm Proficiency</w:t>
-      </w:r>
-    </w:p>
-    <w:p>
-      <w:r>
         <w:rPr>
-          <w:b/>
+          <w:rFonts w:ascii="Garamond" w:hAnsi="Garamond"/>
+          <w:color w:val="2D1F15"/>
+          <w:sz w:val="23"/>
         </w:rPr>
-        <w:t xml:space="preserve">Zdroj: </w:t>
-      </w:r>
-      <w:r>
-        <w:t>Gunslinger, D&amp;D Beyond</w:t>
+        <w:t>Fanda can push beyond normal limits for a brief, decisive burst of action.</w:t>
       </w:r>
     </w:p>
     <w:p>
       <w:pPr>
         <w:pStyle w:val="ListBullet"/>
+        <w:spacing w:after="60"/>
+        <w:ind w:left="360"/>
       </w:pPr>
       <w:r>
-        <w:t>Od 3. urovne, kdy si fighter zvoli archetyp Gunslinger, ziskava proficiency se strelnymi zbranemi.</w:t>
+        <w:rPr>
+          <w:rFonts w:ascii="Garamond" w:hAnsi="Garamond"/>
+          <w:color w:val="2D1F15"/>
+          <w:sz w:val="23"/>
+        </w:rPr>
+        <w:t>On his turn, he can take one additional action on top of his normal action and possible bonus action.</w:t>
       </w:r>
     </w:p>
     <w:p>
       <w:pPr>
         <w:pStyle w:val="ListBullet"/>
+        <w:spacing w:after="60"/>
+        <w:ind w:left="360"/>
       </w:pPr>
       <w:r>
-        <w:t>Diky tomu si k utokum se strelnymi zbranemi pricita proficiency bonus.</w:t>
+        <w:rPr>
+          <w:rFonts w:ascii="Garamond" w:hAnsi="Garamond"/>
+          <w:color w:val="2D1F15"/>
+          <w:sz w:val="23"/>
+        </w:rPr>
+        <w:t>After using Action Surge, he must finish a short or long rest before using it again.</w:t>
       </w:r>
     </w:p>
     <w:p>
       <w:pPr>
-        <w:pStyle w:val="Heading1"/>
+        <w:spacing w:before="260" w:after="80"/>
+        <w:pBdr>
+          <w:bottom w:val="single" w:sz="8" w:space="6" w:color="7A4A22"/>
+        </w:pBdr>
       </w:pPr>
       <w:r>
-        <w:t>Gunsmith</w:t>
-      </w:r>
-    </w:p>
-    <w:p>
-      <w:r>
         <w:rPr>
+          <w:rFonts w:ascii="Garamond" w:hAnsi="Garamond"/>
           <w:b/>
+          <w:color w:val="5C3114"/>
+          <w:sz w:val="32"/>
         </w:rPr>
-        <w:t xml:space="preserve">Zdroj: </w:t>
-      </w:r>
-      <w:r>
-        <w:t>Gunslinger, D&amp;D Beyond</w:t>
+        <w:t>Martial Archetype: Gunslinger</w:t>
       </w:r>
     </w:p>
     <w:p>
       <w:pPr>
         <w:pStyle w:val="ListBullet"/>
+        <w:spacing w:after="60"/>
+        <w:ind w:left="360"/>
       </w:pPr>
       <w:r>
-        <w:t>Od 3. urovne ziskava proficiency s Tinker?s Tools.</w:t>
+        <w:rPr>
+          <w:rFonts w:ascii="Garamond" w:hAnsi="Garamond"/>
+          <w:color w:val="2D1F15"/>
+          <w:sz w:val="23"/>
+        </w:rPr>
+        <w:t>At 3rd level, Fanda's fighter path becomes the Gunslinger archetype, a road of black powder, careful aim, and dangerous invention.</w:t>
       </w:r>
     </w:p>
     <w:p>
       <w:pPr>
         <w:pStyle w:val="ListBullet"/>
+        <w:spacing w:after="60"/>
+        <w:ind w:left="360"/>
       </w:pPr>
       <w:r>
-        <w:t>Tinker?s Tools muze pouzivat k vyrobe munice za polovinu ceny, k opravam poskozenych strelnych zbrani a podle rozhodnuti DM i k navrhu a tvorbe novych zbrani.</w:t>
-      </w:r>
-    </w:p>
-    <w:p>
-      <w:pPr>
-        <w:pStyle w:val="ListBullet"/>
-      </w:pPr>
-      <w:r>
-        <w:t>Nektere experimentalni nebo slozite strelne zbrane mohou byt dostupne jen pres crafting.</w:t>
-      </w:r>
-    </w:p>
-    <w:p>
-      <w:pPr>
-        <w:pStyle w:val="ListBullet"/>
-      </w:pPr>
-      <w:r>
-        <w:t>Strelne zbrane maji specialni vlastnosti: Reload urcuje, kolikrat lze vystrelit pred nabitim; Misfire znamena, ze pri nizkem hodu zbran selze a je treba ji opravit; Explosive muze zasahnout okoli cile ohnivym poskozenim po neuspesnem Dexterity save.</w:t>
-      </w:r>
-    </w:p>
-    <w:p>
-      <w:pPr>
-        <w:pStyle w:val="ListBullet"/>
-      </w:pPr>
-      <w:r>
-        <w:t>Munice je vzacna, ale postava si ji muze pri dostupnych materialech vyrabet pomoci Tinker?s Tools za polovinu ceny.</w:t>
-      </w:r>
-    </w:p>
-    <w:p>
-      <w:pPr>
-        <w:pStyle w:val="Heading1"/>
-      </w:pPr>
-      <w:r>
-        <w:t>Adept Marksman</w:t>
-      </w:r>
-    </w:p>
-    <w:p>
-      <w:r>
         <w:rPr>
-          <w:b/>
+          <w:rFonts w:ascii="Garamond" w:hAnsi="Garamond"/>
+          <w:color w:val="2D1F15"/>
+          <w:sz w:val="23"/>
         </w:rPr>
-        <w:t xml:space="preserve">Zdroj: </w:t>
-      </w:r>
-      <w:r>
-        <w:t>Gunslinger, D&amp;D Beyond</w:t>
-      </w:r>
-    </w:p>
-    <w:p>
-      <w:pPr>
-        <w:pStyle w:val="ListBullet"/>
-      </w:pPr>
-      <w:r>
-        <w:t>Od 3. urovne se postava uci trick shots, kterymi muze pomoci strelnych zbrani poskozovat nebo zneschopnovat protivniky.</w:t>
-      </w:r>
-    </w:p>
-    <w:p>
-      <w:pPr>
-        <w:pStyle w:val="ListBullet"/>
-      </w:pPr>
-      <w:r>
-        <w:t>Na zacatku zna dva trick shots podle vyberu. Dalsi se uci na 7., 10., 15. a 18. urovni; pri nauceni noveho muze vymenit jeden znamy trick shot za jiny.</w:t>
-      </w:r>
-    </w:p>
-    <w:p>
-      <w:pPr>
-        <w:pStyle w:val="ListBullet"/>
-      </w:pPr>
-      <w:r>
-        <w:t>Pouziti trick shotu se hlasi pred hodem na utok a na jeden utok lze pouzit jen jeden trick shot.</w:t>
-      </w:r>
-    </w:p>
-    <w:p>
-      <w:pPr>
-        <w:pStyle w:val="ListBullet"/>
-      </w:pPr>
-      <w:r>
-        <w:t>Postava ma grit points v poctu rovnem Wisdom modifieru, minimalne 1.</w:t>
-      </w:r>
-    </w:p>
-    <w:p>
-      <w:pPr>
-        <w:pStyle w:val="ListBullet"/>
-      </w:pPr>
-      <w:r>
-        <w:t>Grit se obnovuje pri hodu 20 na d20 pri utoku strelnou zbrani, pri zabiti vyznamne hrozby strelnou zbrani podle rozhodnuti DM a kompletne po short nebo long restu.</w:t>
-      </w:r>
-    </w:p>
-    <w:p>
-      <w:pPr>
-        <w:pStyle w:val="ListBullet"/>
-      </w:pPr>
-      <w:r>
-        <w:t>Pokud trick shot vyzaduje saving throw, DC je 8 + proficiency bonus + Dexterity modifier.</w:t>
-      </w:r>
-    </w:p>
-    <w:p>
-      <w:pPr>
-        <w:pStyle w:val="Heading1"/>
-      </w:pPr>
-      <w:r>
-        <w:t>Fighting Style</w:t>
-      </w:r>
-    </w:p>
-    <w:p>
-      <w:r>
-        <w:rPr>
-          <w:b/>
-        </w:rPr>
-        <w:t xml:space="preserve">Zdroj: </w:t>
-      </w:r>
-      <w:r>
-        <w:t>Fighter, D&amp;D Beyond</w:t>
-      </w:r>
-    </w:p>
-    <w:p>
-      <w:pPr>
-        <w:pStyle w:val="ListBullet"/>
-      </w:pPr>
-      <w:r>
-        <w:t>Fighter si na 1. urovni voli jeden bojovy styl jako specializaci.</w:t>
-      </w:r>
-    </w:p>
-    <w:p>
-      <w:pPr>
-        <w:pStyle w:val="ListBullet"/>
-      </w:pPr>
-      <w:r>
-        <w:t>Stejnou volbu Fighting Style si nemuze vzit vicekrat, i kdyby pozdeji ziskal dalsi vyber.</w:t>
-      </w:r>
-    </w:p>
-    <w:p>
-      <w:pPr>
-        <w:pStyle w:val="ListBullet"/>
-      </w:pPr>
-      <w:r>
-        <w:t>Konretni volba z PDF je Close Quarters Shooter, ale tu jsem na zadanych strankach D&amp;D Beyond nenasel.</w:t>
-      </w:r>
-    </w:p>
-    <w:p>
-      <w:pPr>
-        <w:pStyle w:val="Heading1"/>
-      </w:pPr>
-      <w:r>
-        <w:t>Second Wind</w:t>
-      </w:r>
-    </w:p>
-    <w:p>
-      <w:r>
-        <w:rPr>
-          <w:b/>
-        </w:rPr>
-        <w:t xml:space="preserve">Zdroj: </w:t>
-      </w:r>
-      <w:r>
-        <w:t>Fighter, D&amp;D Beyond</w:t>
-      </w:r>
-    </w:p>
-    <w:p>
-      <w:pPr>
-        <w:pStyle w:val="ListBullet"/>
-      </w:pPr>
-      <w:r>
-        <w:t>Fighter ma omezenou zasobu vydrze, kterou muze pouzit k leceni.</w:t>
-      </w:r>
-    </w:p>
-    <w:p>
-      <w:pPr>
-        <w:pStyle w:val="ListBullet"/>
-      </w:pPr>
-      <w:r>
-        <w:t>Ve svem tahu muze jako bonus action obnovit hit pointy v hodnote 1d10 + fighter level.</w:t>
-      </w:r>
-    </w:p>
-    <w:p>
-      <w:pPr>
-        <w:pStyle w:val="ListBullet"/>
-      </w:pPr>
-      <w:r>
-        <w:t>Po pouziti je schopnost znovu dostupna az po short nebo long restu.</w:t>
-      </w:r>
-    </w:p>
-    <w:p>
-      <w:pPr>
-        <w:pStyle w:val="Heading1"/>
-      </w:pPr>
-      <w:r>
-        <w:t>Action Surge</w:t>
-      </w:r>
-    </w:p>
-    <w:p>
-      <w:r>
-        <w:rPr>
-          <w:b/>
-        </w:rPr>
-        <w:t xml:space="preserve">Zdroj: </w:t>
-      </w:r>
-      <w:r>
-        <w:t>Fighter, D&amp;D Beyond</w:t>
-      </w:r>
-    </w:p>
-    <w:p>
-      <w:pPr>
-        <w:pStyle w:val="ListBullet"/>
-      </w:pPr>
-      <w:r>
-        <w:t>Od 2. urovne se fighter muze na okamzik prekonat a ve svem tahu ziskat jednu dalsi akci.</w:t>
-      </w:r>
-    </w:p>
-    <w:p>
-      <w:pPr>
-        <w:pStyle w:val="ListBullet"/>
-      </w:pPr>
-      <w:r>
-        <w:t>Po pouziti je schopnost znovu dostupna az po short nebo long restu.</w:t>
-      </w:r>
-    </w:p>
-    <w:p>
-      <w:pPr>
-        <w:pStyle w:val="ListBullet"/>
-      </w:pPr>
-      <w:r>
-        <w:t>Na 17. urovni lze mit dve pouziti mezi resty, ale porad jen jedno pouziti v jednom tahu.</w:t>
-      </w:r>
-    </w:p>
-    <w:p>
-      <w:pPr>
-        <w:pStyle w:val="Heading1"/>
-      </w:pPr>
-      <w:r>
-        <w:t>Martial Archetype</w:t>
-      </w:r>
-    </w:p>
-    <w:p>
-      <w:r>
-        <w:rPr>
-          <w:b/>
-        </w:rPr>
-        <w:t xml:space="preserve">Zdroj: </w:t>
-      </w:r>
-      <w:r>
-        <w:t>Fighter, D&amp;D Beyond</w:t>
-      </w:r>
-    </w:p>
-    <w:p>
-      <w:pPr>
-        <w:pStyle w:val="ListBullet"/>
-      </w:pPr>
-      <w:r>
-        <w:t>Na 3. urovni si fighter zvoli martial archetype, tedy bojovy smer, ktery urcuje jeho styl a techniky.</w:t>
-      </w:r>
-    </w:p>
-    <w:p>
-      <w:pPr>
-        <w:pStyle w:val="ListBullet"/>
-      </w:pPr>
-      <w:r>
-        <w:t>Zvoleny archetyp dava schopnosti na 3., 7., 10., 15. a 18. urovni.</w:t>
-      </w:r>
-    </w:p>
-    <w:p>
-      <w:pPr>
-        <w:pStyle w:val="ListBullet"/>
-      </w:pPr>
-      <w:r>
-        <w:t>Fanda ma v PDF uvedeny archetyp Gunslinger.</w:t>
-      </w:r>
-    </w:p>
-    <w:p>
-      <w:pPr>
-        <w:pStyle w:val="Heading1"/>
-      </w:pPr>
-      <w:r>
-        <w:t>Chybejici podle zadanych zdroju</w:t>
-      </w:r>
-    </w:p>
-    <w:p>
-      <w:pPr>
-        <w:pStyle w:val="ListBullet"/>
-      </w:pPr>
-      <w:r>
-        <w:t>Fighting Style: Close Quarters Shooter</w:t>
-      </w:r>
-    </w:p>
-    <w:p>
-      <w:r>
-        <w:t>Na strance Gunslinger ani na strance Fighter jsem nenasel konkretni pravidlovy text pro volbu Close Quarters Shooter. Na Fighter strance je jen obecne pravidlo pro vyber Fighting Style a zakladni dostupne volby, ale Close Quarters Shooter mezi nimi neni.</w:t>
+        <w:t>This archetype shapes his later features and turns firearms into the center of his fighting style.</w:t>
       </w:r>
     </w:p>
     <w:sectPr>
       <w:pgSz w:w="12240" w:h="15840"/>
-      <w:pgMar w:top="1440" w:right="1800" w:bottom="1440" w:left="1800" w:header="720" w:footer="720" w:gutter="0"/>
+      <w:pgMar w:top="936" w:right="1080" w:bottom="936" w:left="1080" w:header="720" w:footer="720" w:gutter="0"/>
       <w:cols w:space="720"/>
       <w:docGrid w:linePitch="360"/>
     </w:sectPr>
@@ -855,8 +829,9 @@
     <w:qFormat/>
     <w:rsid w:val="00FC693F"/>
     <w:rPr>
-      <w:rFonts w:ascii="Calibri" w:hAnsi="Calibri"/>
-      <w:sz w:val="22"/>
+      <w:rFonts w:ascii="Garamond" w:hAnsi="Garamond"/>
+      <w:color w:val="2D1F15"/>
+      <w:sz w:val="23"/>
     </w:rPr>
   </w:style>
   <w:style w:type="paragraph" w:styleId="Header">
@@ -918,7 +893,7 @@
       <w:outlineLvl w:val="0"/>
     </w:pPr>
     <w:rPr>
-      <w:rFonts w:asciiTheme="majorHAnsi" w:eastAsiaTheme="majorEastAsia" w:hAnsiTheme="majorHAnsi" w:cstheme="majorBidi"/>
+      <w:rFonts w:asciiTheme="majorHAnsi" w:eastAsiaTheme="majorEastAsia" w:hAnsiTheme="majorHAnsi" w:cstheme="majorBidi" w:ascii="Garamond" w:hAnsi="Garamond"/>
       <w:b/>
       <w:bCs/>
       <w:color w:val="365F91" w:themeColor="accent1" w:themeShade="BF"/>
@@ -942,7 +917,7 @@
       <w:outlineLvl w:val="1"/>
     </w:pPr>
     <w:rPr>
-      <w:rFonts w:asciiTheme="majorHAnsi" w:eastAsiaTheme="majorEastAsia" w:hAnsiTheme="majorHAnsi" w:cstheme="majorBidi"/>
+      <w:rFonts w:asciiTheme="majorHAnsi" w:eastAsiaTheme="majorEastAsia" w:hAnsiTheme="majorHAnsi" w:cstheme="majorBidi" w:ascii="Garamond" w:hAnsi="Garamond"/>
       <w:b/>
       <w:bCs/>
       <w:color w:val="4F81BD" w:themeColor="accent1"/>
@@ -1207,7 +1182,7 @@
       <w:contextualSpacing/>
     </w:pPr>
     <w:rPr>
-      <w:rFonts w:asciiTheme="majorHAnsi" w:eastAsiaTheme="majorEastAsia" w:hAnsiTheme="majorHAnsi" w:cstheme="majorBidi"/>
+      <w:rFonts w:asciiTheme="majorHAnsi" w:eastAsiaTheme="majorEastAsia" w:hAnsiTheme="majorHAnsi" w:cstheme="majorBidi" w:ascii="Garamond" w:hAnsi="Garamond"/>
       <w:color w:val="17365D" w:themeColor="text2" w:themeShade="BF"/>
       <w:spacing w:val="5"/>
       <w:kern w:val="28"/>

</xml_diff>

<commit_message>
Restyle Fanda document for print
</commit_message>
<xml_diff>
--- a/Essentials/Fanda.docx
+++ b/Essentials/Fanda.docx
@@ -4,17 +4,17 @@
   <w:body>
     <w:p>
       <w:pPr>
-        <w:spacing w:after="200"/>
+        <w:spacing w:after="240"/>
         <w:jc w:val="center"/>
-        <w:shd w:fill="F3E5C0"/>
         <w:pBdr>
-          <w:bottom w:val="single" w:sz="8" w:space="6" w:color="9B6A2D"/>
+          <w:bottom w:val="single" w:sz="10" w:space="6" w:color="9B6A2D"/>
         </w:pBdr>
       </w:pPr>
       <w:r>
         <w:rPr>
           <w:rFonts w:ascii="Garamond" w:hAnsi="Garamond"/>
           <w:b/>
+          <w:i w:val="0"/>
           <w:color w:val="4A260F"/>
           <w:sz w:val="56"/>
         </w:rPr>
@@ -32,6 +32,7 @@
         <w:rPr>
           <w:rFonts w:ascii="Garamond" w:hAnsi="Garamond"/>
           <w:b/>
+          <w:i w:val="0"/>
           <w:color w:val="5C3114"/>
           <w:sz w:val="32"/>
         </w:rPr>
@@ -47,6 +48,8 @@
       <w:r>
         <w:rPr>
           <w:rFonts w:ascii="Garamond" w:hAnsi="Garamond"/>
+          <w:b w:val="0"/>
+          <w:i w:val="0"/>
           <w:color w:val="2D1F15"/>
           <w:sz w:val="23"/>
         </w:rPr>
@@ -62,6 +65,8 @@
       <w:r>
         <w:rPr>
           <w:rFonts w:ascii="Garamond" w:hAnsi="Garamond"/>
+          <w:b w:val="0"/>
+          <w:i w:val="0"/>
           <w:color w:val="2D1F15"/>
           <w:sz w:val="23"/>
         </w:rPr>
@@ -79,6 +84,7 @@
         <w:rPr>
           <w:rFonts w:ascii="Garamond" w:hAnsi="Garamond"/>
           <w:b/>
+          <w:i w:val="0"/>
           <w:color w:val="5C3114"/>
           <w:sz w:val="32"/>
         </w:rPr>
@@ -94,6 +100,8 @@
       <w:r>
         <w:rPr>
           <w:rFonts w:ascii="Garamond" w:hAnsi="Garamond"/>
+          <w:b w:val="0"/>
+          <w:i w:val="0"/>
           <w:color w:val="2D1F15"/>
           <w:sz w:val="23"/>
         </w:rPr>
@@ -109,6 +117,8 @@
       <w:r>
         <w:rPr>
           <w:rFonts w:ascii="Garamond" w:hAnsi="Garamond"/>
+          <w:b w:val="0"/>
+          <w:i w:val="0"/>
           <w:color w:val="2D1F15"/>
           <w:sz w:val="23"/>
         </w:rPr>
@@ -124,6 +134,8 @@
       <w:r>
         <w:rPr>
           <w:rFonts w:ascii="Garamond" w:hAnsi="Garamond"/>
+          <w:b w:val="0"/>
+          <w:i w:val="0"/>
           <w:color w:val="2D1F15"/>
           <w:sz w:val="23"/>
         </w:rPr>
@@ -139,6 +151,8 @@
       <w:r>
         <w:rPr>
           <w:rFonts w:ascii="Garamond" w:hAnsi="Garamond"/>
+          <w:b w:val="0"/>
+          <w:i w:val="0"/>
           <w:color w:val="2D1F15"/>
           <w:sz w:val="23"/>
         </w:rPr>
@@ -156,6 +170,7 @@
         <w:rPr>
           <w:rFonts w:ascii="Garamond" w:hAnsi="Garamond"/>
           <w:b/>
+          <w:i w:val="0"/>
           <w:color w:val="5C3114"/>
           <w:sz w:val="32"/>
         </w:rPr>
@@ -171,6 +186,8 @@
       <w:r>
         <w:rPr>
           <w:rFonts w:ascii="Garamond" w:hAnsi="Garamond"/>
+          <w:b w:val="0"/>
+          <w:i w:val="0"/>
           <w:color w:val="2D1F15"/>
           <w:sz w:val="23"/>
         </w:rPr>
@@ -186,6 +203,8 @@
       <w:r>
         <w:rPr>
           <w:rFonts w:ascii="Garamond" w:hAnsi="Garamond"/>
+          <w:b w:val="0"/>
+          <w:i w:val="0"/>
           <w:color w:val="2D1F15"/>
           <w:sz w:val="23"/>
         </w:rPr>
@@ -201,6 +220,8 @@
       <w:r>
         <w:rPr>
           <w:rFonts w:ascii="Garamond" w:hAnsi="Garamond"/>
+          <w:b w:val="0"/>
+          <w:i w:val="0"/>
           <w:color w:val="2D1F15"/>
           <w:sz w:val="23"/>
         </w:rPr>
@@ -216,6 +237,8 @@
       <w:r>
         <w:rPr>
           <w:rFonts w:ascii="Garamond" w:hAnsi="Garamond"/>
+          <w:b w:val="0"/>
+          <w:i w:val="0"/>
           <w:color w:val="2D1F15"/>
           <w:sz w:val="23"/>
         </w:rPr>
@@ -231,6 +254,8 @@
       <w:r>
         <w:rPr>
           <w:rFonts w:ascii="Garamond" w:hAnsi="Garamond"/>
+          <w:b w:val="0"/>
+          <w:i w:val="0"/>
           <w:color w:val="2D1F15"/>
           <w:sz w:val="23"/>
         </w:rPr>
@@ -248,6 +273,7 @@
         <w:rPr>
           <w:rFonts w:ascii="Garamond" w:hAnsi="Garamond"/>
           <w:b/>
+          <w:i w:val="0"/>
           <w:color w:val="5C3114"/>
           <w:sz w:val="32"/>
         </w:rPr>
@@ -263,6 +289,8 @@
       <w:r>
         <w:rPr>
           <w:rFonts w:ascii="Garamond" w:hAnsi="Garamond"/>
+          <w:b w:val="0"/>
+          <w:i w:val="0"/>
           <w:color w:val="2D1F15"/>
           <w:sz w:val="23"/>
         </w:rPr>
@@ -278,6 +306,8 @@
       <w:r>
         <w:rPr>
           <w:rFonts w:ascii="Garamond" w:hAnsi="Garamond"/>
+          <w:b w:val="0"/>
+          <w:i w:val="0"/>
           <w:color w:val="2D1F15"/>
           <w:sz w:val="23"/>
         </w:rPr>
@@ -295,6 +325,7 @@
         <w:rPr>
           <w:rFonts w:ascii="Garamond" w:hAnsi="Garamond"/>
           <w:b/>
+          <w:i w:val="0"/>
           <w:color w:val="5C3114"/>
           <w:sz w:val="32"/>
         </w:rPr>
@@ -310,6 +341,8 @@
       <w:r>
         <w:rPr>
           <w:rFonts w:ascii="Garamond" w:hAnsi="Garamond"/>
+          <w:b w:val="0"/>
+          <w:i w:val="0"/>
           <w:color w:val="2D1F15"/>
           <w:sz w:val="23"/>
         </w:rPr>
@@ -325,6 +358,8 @@
       <w:r>
         <w:rPr>
           <w:rFonts w:ascii="Garamond" w:hAnsi="Garamond"/>
+          <w:b w:val="0"/>
+          <w:i w:val="0"/>
           <w:color w:val="2D1F15"/>
           <w:sz w:val="23"/>
         </w:rPr>
@@ -340,6 +375,8 @@
       <w:r>
         <w:rPr>
           <w:rFonts w:ascii="Garamond" w:hAnsi="Garamond"/>
+          <w:b w:val="0"/>
+          <w:i w:val="0"/>
           <w:color w:val="2D1F15"/>
           <w:sz w:val="23"/>
         </w:rPr>
@@ -357,6 +394,7 @@
         <w:rPr>
           <w:rFonts w:ascii="Garamond" w:hAnsi="Garamond"/>
           <w:b/>
+          <w:i w:val="0"/>
           <w:color w:val="5C3114"/>
           <w:sz w:val="32"/>
         </w:rPr>
@@ -372,6 +410,8 @@
       <w:r>
         <w:rPr>
           <w:rFonts w:ascii="Garamond" w:hAnsi="Garamond"/>
+          <w:b w:val="0"/>
+          <w:i w:val="0"/>
           <w:color w:val="2D1F15"/>
           <w:sz w:val="23"/>
         </w:rPr>
@@ -387,6 +427,8 @@
       <w:r>
         <w:rPr>
           <w:rFonts w:ascii="Garamond" w:hAnsi="Garamond"/>
+          <w:b w:val="0"/>
+          <w:i w:val="0"/>
           <w:color w:val="2D1F15"/>
           <w:sz w:val="23"/>
         </w:rPr>
@@ -402,6 +444,8 @@
       <w:r>
         <w:rPr>
           <w:rFonts w:ascii="Garamond" w:hAnsi="Garamond"/>
+          <w:b w:val="0"/>
+          <w:i w:val="0"/>
           <w:color w:val="2D1F15"/>
           <w:sz w:val="23"/>
         </w:rPr>
@@ -419,6 +463,7 @@
         <w:rPr>
           <w:rFonts w:ascii="Garamond" w:hAnsi="Garamond"/>
           <w:b/>
+          <w:i w:val="0"/>
           <w:color w:val="5C3114"/>
           <w:sz w:val="32"/>
         </w:rPr>
@@ -434,6 +479,8 @@
       <w:r>
         <w:rPr>
           <w:rFonts w:ascii="Garamond" w:hAnsi="Garamond"/>
+          <w:b w:val="0"/>
+          <w:i w:val="0"/>
           <w:color w:val="2D1F15"/>
           <w:sz w:val="23"/>
         </w:rPr>
@@ -449,6 +496,8 @@
       <w:r>
         <w:rPr>
           <w:rFonts w:ascii="Garamond" w:hAnsi="Garamond"/>
+          <w:b w:val="0"/>
+          <w:i w:val="0"/>
           <w:color w:val="2D1F15"/>
           <w:sz w:val="23"/>
         </w:rPr>
@@ -893,7 +942,7 @@
       <w:outlineLvl w:val="0"/>
     </w:pPr>
     <w:rPr>
-      <w:rFonts w:asciiTheme="majorHAnsi" w:eastAsiaTheme="majorEastAsia" w:hAnsiTheme="majorHAnsi" w:cstheme="majorBidi" w:ascii="Garamond" w:hAnsi="Garamond"/>
+      <w:rFonts w:asciiTheme="majorHAnsi" w:eastAsiaTheme="majorEastAsia" w:hAnsiTheme="majorHAnsi" w:cstheme="majorBidi"/>
       <w:b/>
       <w:bCs/>
       <w:color w:val="365F91" w:themeColor="accent1" w:themeShade="BF"/>
@@ -917,7 +966,7 @@
       <w:outlineLvl w:val="1"/>
     </w:pPr>
     <w:rPr>
-      <w:rFonts w:asciiTheme="majorHAnsi" w:eastAsiaTheme="majorEastAsia" w:hAnsiTheme="majorHAnsi" w:cstheme="majorBidi" w:ascii="Garamond" w:hAnsi="Garamond"/>
+      <w:rFonts w:asciiTheme="majorHAnsi" w:eastAsiaTheme="majorEastAsia" w:hAnsiTheme="majorHAnsi" w:cstheme="majorBidi"/>
       <w:b/>
       <w:bCs/>
       <w:color w:val="4F81BD" w:themeColor="accent1"/>
@@ -1182,7 +1231,7 @@
       <w:contextualSpacing/>
     </w:pPr>
     <w:rPr>
-      <w:rFonts w:asciiTheme="majorHAnsi" w:eastAsiaTheme="majorEastAsia" w:hAnsiTheme="majorHAnsi" w:cstheme="majorBidi" w:ascii="Garamond" w:hAnsi="Garamond"/>
+      <w:rFonts w:asciiTheme="majorHAnsi" w:eastAsiaTheme="majorEastAsia" w:hAnsiTheme="majorHAnsi" w:cstheme="majorBidi"/>
       <w:color w:val="17365D" w:themeColor="text2" w:themeShade="BF"/>
       <w:spacing w:val="5"/>
       <w:kern w:val="28"/>

</xml_diff>